<commit_message>
Verify all clients against new age-bracket framework; fix Elizabeth's protein tier
Checked every client's nutrition targets against the Age Bracket
Programming Framework added to CLAUDE.md. icons_template.js's
proteinTargets() already implements identical tier logic, so all
script-generated clients (August Olivia, Johanna Castillo) were
already correct and rebuilt byte-identical.

Elizabeth Poyner's hand-maintained doc had a real bug: her nutrition
table was labeled "1.8-2.0 g/kg for women 50+" (that's actually the
40+ tier) instead of the correct 2.0-2.2 g/kg 50+ tier. Corrected to
104-115g/day (2.0-2.2 g/kg) in both the intro line and the table.

Co-Authored-By: Claude Sonnet 5 <noreply@anthropic.com>
Claude-Session: https://claude.ai/code/session_01VTRA12TAy4P16NRVKS4SK5
</commit_message>
<xml_diff>
--- a/clients/elizabeth_poyner/Elizabeth_Poyner_5Day_Training_Plan.docx
+++ b/clients/elizabeth_poyner/Elizabeth_Poyner_5Day_Training_Plan.docx
@@ -2769,7 +2769,7 @@
           <w:sz w:val="17"/>
           <w:szCs w:val="17"/>
         </w:rPr>
-        <w:t xml:space="preserve">Target: 94–115g protein/day (1.8–2.2 g/kg). Per meal: ~21g minimum across 4+ meals to hit leucine threshold. Creatine: 3–5g/day — strongly indicated for bone, cognitive, and strength benefits at this age. Collagen: 15g + 50mg Vitamin C, 30–60 min before heavy sessions.</w:t>
+        <w:t>Target: 104–115g protein/day (2.0–2.2 g/kg). Per meal: ~21g minimum across 4+ meals to hit leucine threshold. Creatine: 3–5g/day — strongly indicated for bone, cognitive, and strength benefits at this age. Collagen: 15g + 50mg Vitamin C, 30–60 min before heavy sessions.</w:t>
       </w:r>
     </w:p>
     <w:p>
@@ -2906,7 +2906,7 @@
                 <w:sz w:val="18"/>
                 <w:szCs w:val="18"/>
               </w:rPr>
-              <w:t xml:space="preserve">94–104g / day</w:t>
+              <w:t>104–115g / day</w:t>
             </w:r>
           </w:p>
           <w:p>
@@ -2965,7 +2965,7 @@
                 <w:sz w:val="15"/>
                 <w:szCs w:val="15"/>
               </w:rPr>
-              <w:t xml:space="preserve">1.8–2.0 g/kg for women 50+ (blunted muscle protein synthesis response to feeding)</w:t>
+              <w:t>2.0–2.2 g/kg for women 50+ (blunted muscle protein synthesis response to feeding)</w:t>
             </w:r>
           </w:p>
         </w:tc>

</xml_diff>

<commit_message>
Nancy Avitable: promote warm-up prose exercises to audited rows, fix RDL load placeholder; Elizabeth Poyner: close last RIR gap
</commit_message>
<xml_diff>
--- a/clients/elizabeth_poyner/Elizabeth_Poyner_5Day_Training_Plan.docx
+++ b/clients/elizabeth_poyner/Elizabeth_Poyner_5Day_Training_Plan.docx
@@ -4285,6 +4285,17 @@
                 <w:szCs w:val="17"/>
               </w:rPr>
               <w:t xml:space="preserve">Elbows at 45°. Squeeze chest at top. Full range every rep.</w:t>
+            </w:r>
+            <w:r>
+              <w:rPr>
+                <w:rFonts w:ascii="Arial" w:cs="Arial" w:eastAsia="Arial" w:hAnsi="Arial"/>
+                <w:i/>
+                <w:iCs/>
+                <w:color w:val="00695C"/>
+                <w:sz w:val="14"/>
+                <w:szCs w:val="14"/>
+              </w:rPr>
+              <w:t xml:space="preserve">  1 RIR — hypertrophy-priority accessory</w:t>
             </w:r>
           </w:p>
         </w:tc>

</xml_diff>

<commit_message>
Block Method batch 1: audit-clear, polish fixes applied pre-delivery
Independent audit verdict: zero delivery-blocking defects across all six
documents. Fixes applied from the polish findings:
- Kelly (studio + travel): hinge stop-signal pickup/set-down flag extended
  to ALL loaded carries (Friday farmer + suitcase, Tuesday closer) for
  consistency with the new integration carry's flag
- Kelly travel: stale 'cable adductor pull' cross-ref updated to match the
  studio doc's Kieser rename
- Elizabeth: live asymmetry text updated to the corrected >=10% relative
  trigger framing (historical Week-8 rescan record untouched); 'jump slot'
  jargon reworded
- Kelly Tuesday push-up rows: RIR label reworded to 'hypertrophy priority'
  (tier unchanged) to fit the secondary-compound block title
All six documents regenerated and fix-verified.

Co-Authored-By: Claude Fable 5 <noreply@anthropic.com>
Claude-Session: https://claude.ai/code/session_01VTRA12TAy4P16NRVKS4SK5
</commit_message>
<xml_diff>
--- a/clients/elizabeth_poyner/Elizabeth_Poyner_5Day_Training_Plan.docx
+++ b/clients/elizabeth_poyner/Elizabeth_Poyner_5Day_Training_Plan.docx
@@ -1251,7 +1251,7 @@
           <w:sz w:val="17"/>
           <w:szCs w:val="17"/>
         </w:rPr>
-        <w:t xml:space="preserve">Body Fat 27.1% reads lower than 80% of Styku's peer comparison group. Both segmental gaps (arms 0.2 lbs, legs 0.4 lbs) sit below the 0.5 lb Asymmetry Protocol trigger — monitor only, no unilateral-lead protocol change indicated.</w:t>
+        <w:t xml:space="preserve">Body Fat 27.1% reads lower than 80% of Styku's peer comparison group. Both segmental gaps (arms 0.2 lbs ≈ 3%, legs 0.4 lbs ≈ 3%) sit far below the ≥10% relative Asymmetry Protocol trigger — monitor only, no unilateral-lead protocol change indicated.</w:t>
       </w:r>
     </w:p>
     <w:p>
@@ -2138,7 +2138,7 @@
                 <w:sz w:val="16"/>
                 <w:szCs w:val="16"/>
               </w:rPr>
-              <w:t xml:space="preserve">Wk4 target: 45 lbs. Previously left-leg-lead (per original leg LST gap); Week 8 rescan confirmed gap closed below the 0.5 lb threshold — proceed evenly both sides.</w:t>
+              <w:t xml:space="preserve">Wk4 target: 45 lbs. Previously left-leg-lead (per original leg LST gap); Week 8 rescan confirmed the gap closed (0.4 lbs ≈ 3% — far below the ≥10% relative trigger) — proceed evenly both sides.</w:t>
             </w:r>
           </w:p>
         </w:tc>
@@ -21062,7 +21062,7 @@
           <w:sz w:val="17"/>
           <w:szCs w:val="17"/>
         </w:rPr>
-        <w:t xml:space="preserve">Power is this day's primary quality and runs first, fresh — moving a sub-maximal load with maximal intent, full recovery between sets. Rotate the jump slot by how the legs feel: trap bar jump, box step-up jump, or — on a day that wants less impact — a brisk step-up driven with full intent and no jump. The speed sled stays lighter than Thursday's by design; the intent is the exercise.</w:t>
+        <w:t xml:space="preserve">Power is this day's primary quality and runs first, fresh — moving a sub-maximal load with maximal intent, full recovery between sets. Rotate the jump selection by how the legs feel: trap bar jump, box step-up jump, or — on a day that wants less impact — a brisk step-up driven with full intent and no jump. The speed sled stays lighter than Thursday's by design; the intent is the exercise.</w:t>
       </w:r>
     </w:p>
     <w:tbl>

</xml_diff>